<commit_message>
Intègre le travail Statistiques local sur stat1 après résolution des conflits stash.
Restaure les vues/point journalier, composants frontend manquants et volume_horaire complet pour la CI.

Co-authored-by: Cursor <cursoragent@cursor.com>
</commit_message>
<xml_diff>
--- a/docs/Manuel utilisateur App Statistiques.docx
+++ b/docs/Manuel utilisateur App Statistiques.docx
@@ -154,7 +154,7 @@
               <w:rPr>
                 <w:sz w:val="20"/>
               </w:rPr>
-              <w:t>2.0.0</w:t>
+              <w:t>2.1.0</w:t>
             </w:r>
           </w:p>
         </w:tc>
@@ -188,7 +188,7 @@
               <w:rPr>
                 <w:sz w:val="20"/>
               </w:rPr>
-              <w:t>03/06/2026</w:t>
+              <w:t>08/06/2026</w:t>
             </w:r>
           </w:p>
         </w:tc>
@@ -2990,8 +2990,531 @@
           </w:p>
         </w:tc>
       </w:tr>
+      <w:tr>
+        <w:tc>
+          <w:tcPr>
+            <w:tcW w:type="dxa" w:w="4703"/>
+          </w:tcPr>
+          <w:p>
+            <w:pPr>
+              <w:jc w:val="left"/>
+            </w:pPr>
+            <w:r>
+              <w:rPr>
+                <w:sz w:val="20"/>
+              </w:rPr>
+              <w:t>**Assiduité séance**</w:t>
+            </w:r>
+          </w:p>
+        </w:tc>
+        <w:tc>
+          <w:tcPr>
+            <w:tcW w:type="dxa" w:w="4703"/>
+          </w:tcPr>
+          <w:p>
+            <w:pPr>
+              <w:jc w:val="left"/>
+            </w:pPr>
+            <w:r>
+              <w:rPr>
+                <w:sz w:val="20"/>
+              </w:rPr>
+              <w:t>Places présentes ÷ places attendues sur les séances terminées (dashboard, alertes, historique)</w:t>
+            </w:r>
+          </w:p>
+        </w:tc>
+      </w:tr>
+      <w:tr>
+        <w:tc>
+          <w:tcPr>
+            <w:tcW w:type="dxa" w:w="4703"/>
+          </w:tcPr>
+          <w:p>
+            <w:pPr>
+              <w:jc w:val="left"/>
+            </w:pPr>
+            <w:r>
+              <w:rPr>
+                <w:sz w:val="20"/>
+              </w:rPr>
+              <w:t>**Couverture auditeurs**</w:t>
+            </w:r>
+          </w:p>
+        </w:tc>
+        <w:tc>
+          <w:tcPr>
+            <w:tcW w:type="dxa" w:w="4703"/>
+          </w:tcPr>
+          <w:p>
+            <w:pPr>
+              <w:jc w:val="left"/>
+            </w:pPr>
+            <w:r>
+              <w:rPr>
+                <w:sz w:val="20"/>
+              </w:rPr>
+              <w:t>Auditeurs avec ≥ 1 présence ÷ inscrits (logique des bilans CPFAE)</w:t>
+            </w:r>
+          </w:p>
+        </w:tc>
+      </w:tr>
+      <w:tr>
+        <w:tc>
+          <w:tcPr>
+            <w:tcW w:type="dxa" w:w="4703"/>
+          </w:tcPr>
+          <w:p>
+            <w:pPr>
+              <w:jc w:val="left"/>
+            </w:pPr>
+            <w:r>
+              <w:rPr>
+                <w:sz w:val="20"/>
+              </w:rPr>
+              <w:t>**Événements absence / suspect**</w:t>
+            </w:r>
+          </w:p>
+        </w:tc>
+        <w:tc>
+          <w:tcPr>
+            <w:tcW w:type="dxa" w:w="4703"/>
+          </w:tcPr>
+          <w:p>
+            <w:pPr>
+              <w:jc w:val="left"/>
+            </w:pPr>
+            <w:r>
+              <w:rPr>
+                <w:sz w:val="20"/>
+              </w:rPr>
+              <w:t>Pointages « absent non badgé » ou « hors ligne suspect » rapportés aux inscrits</w:t>
+            </w:r>
+          </w:p>
+        </w:tc>
+      </w:tr>
+      <w:tr>
+        <w:tc>
+          <w:tcPr>
+            <w:tcW w:type="dxa" w:w="4703"/>
+          </w:tcPr>
+          <w:p>
+            <w:pPr>
+              <w:jc w:val="left"/>
+            </w:pPr>
+            <w:r>
+              <w:rPr>
+                <w:sz w:val="20"/>
+              </w:rPr>
+              <w:t>**Avancement VH (sessions clôturées)**</w:t>
+            </w:r>
+          </w:p>
+        </w:tc>
+        <w:tc>
+          <w:tcPr>
+            <w:tcW w:type="dxa" w:w="4703"/>
+          </w:tcPr>
+          <w:p>
+            <w:pPr>
+              <w:jc w:val="left"/>
+            </w:pPr>
+            <w:r>
+              <w:rPr>
+                <w:sz w:val="20"/>
+              </w:rPr>
+              <w:t>Heures réalisées ÷ heures prévues sur les séances clôturées du périmètre</w:t>
+            </w:r>
+          </w:p>
+        </w:tc>
+      </w:tr>
     </w:tbl>
     <w:p/>
+    <w:p>
+      <w:pPr>
+        <w:pStyle w:val="Heading3"/>
+      </w:pPr>
+      <w:r>
+        <w:t>5.1 Comment lire les chiffres</w:t>
+      </w:r>
+    </w:p>
+    <w:p>
+      <w:r>
+        <w:rPr>
+          <w:sz w:val="22"/>
+        </w:rPr>
+        <w:t xml:space="preserve">Deux logiques de taux coexistent dans le module. Un </w:t>
+      </w:r>
+      <w:r>
+        <w:rPr>
+          <w:b/>
+          <w:sz w:val="22"/>
+        </w:rPr>
+        <w:t>bandeau explicatif</w:t>
+      </w:r>
+      <w:r>
+        <w:rPr>
+          <w:sz w:val="22"/>
+        </w:rPr>
+        <w:t xml:space="preserve"> sous les filtres rappelle cette distinction à chaque visite.</w:t>
+      </w:r>
+    </w:p>
+    <w:tbl>
+      <w:tblPr>
+        <w:tblStyle w:val="TableGrid"/>
+        <w:tblW w:type="auto" w:w="0"/>
+        <w:tblLook w:firstColumn="1" w:firstRow="1" w:lastColumn="0" w:lastRow="0" w:noHBand="0" w:noVBand="1" w:val="04A0"/>
+      </w:tblPr>
+      <w:tblGrid>
+        <w:gridCol w:w="3135"/>
+        <w:gridCol w:w="3135"/>
+        <w:gridCol w:w="3135"/>
+      </w:tblGrid>
+      <w:tr>
+        <w:tc>
+          <w:tcPr>
+            <w:tcW w:type="dxa" w:w="3135"/>
+            <w:shd w:fill="43A047" w:val="clear"/>
+          </w:tcPr>
+          <w:p>
+            <w:pPr>
+              <w:jc w:val="center"/>
+            </w:pPr>
+            <w:r>
+              <w:rPr>
+                <w:b/>
+                <w:color w:val="FFFFFF"/>
+                <w:sz w:val="18"/>
+              </w:rPr>
+              <w:t>Indicateur affiché</w:t>
+            </w:r>
+          </w:p>
+        </w:tc>
+        <w:tc>
+          <w:tcPr>
+            <w:tcW w:type="dxa" w:w="3135"/>
+            <w:shd w:fill="43A047" w:val="clear"/>
+          </w:tcPr>
+          <w:p>
+            <w:pPr>
+              <w:jc w:val="center"/>
+            </w:pPr>
+            <w:r>
+              <w:rPr>
+                <w:b/>
+                <w:color w:val="FFFFFF"/>
+                <w:sz w:val="18"/>
+              </w:rPr>
+              <w:t>Formule</w:t>
+            </w:r>
+          </w:p>
+        </w:tc>
+        <w:tc>
+          <w:tcPr>
+            <w:tcW w:type="dxa" w:w="3135"/>
+            <w:shd w:fill="43A047" w:val="clear"/>
+          </w:tcPr>
+          <w:p>
+            <w:pPr>
+              <w:jc w:val="center"/>
+            </w:pPr>
+            <w:r>
+              <w:rPr>
+                <w:b/>
+                <w:color w:val="FFFFFF"/>
+                <w:sz w:val="18"/>
+              </w:rPr>
+              <w:t>Où le trouver</w:t>
+            </w:r>
+          </w:p>
+        </w:tc>
+      </w:tr>
+      <w:tr>
+        <w:tc>
+          <w:tcPr>
+            <w:tcW w:type="dxa" w:w="3135"/>
+          </w:tcPr>
+          <w:p>
+            <w:pPr>
+              <w:jc w:val="left"/>
+            </w:pPr>
+            <w:r>
+              <w:rPr>
+                <w:sz w:val="20"/>
+              </w:rPr>
+              <w:t>**Assiduité séance**</w:t>
+            </w:r>
+          </w:p>
+        </w:tc>
+        <w:tc>
+          <w:tcPr>
+            <w:tcW w:type="dxa" w:w="3135"/>
+          </w:tcPr>
+          <w:p>
+            <w:pPr>
+              <w:jc w:val="left"/>
+            </w:pPr>
+            <w:r>
+              <w:rPr>
+                <w:sz w:val="20"/>
+              </w:rPr>
+              <w:t>places présentes ÷ places attendues (séances terminées)</w:t>
+            </w:r>
+          </w:p>
+        </w:tc>
+        <w:tc>
+          <w:tcPr>
+            <w:tcW w:type="dxa" w:w="3135"/>
+          </w:tcPr>
+          <w:p>
+            <w:pPr>
+              <w:jc w:val="left"/>
+            </w:pPr>
+            <w:r>
+              <w:rPr>
+                <w:sz w:val="20"/>
+              </w:rPr>
+              <w:t>Vue d'ensemble, alertes, historique, tableaux « par formation / grade / secrétariat »</w:t>
+            </w:r>
+          </w:p>
+        </w:tc>
+      </w:tr>
+      <w:tr>
+        <w:tc>
+          <w:tcPr>
+            <w:tcW w:type="dxa" w:w="3135"/>
+          </w:tcPr>
+          <w:p>
+            <w:pPr>
+              <w:jc w:val="left"/>
+            </w:pPr>
+            <w:r>
+              <w:rPr>
+                <w:sz w:val="20"/>
+              </w:rPr>
+              <w:t>**Couverture auditeurs**</w:t>
+            </w:r>
+          </w:p>
+        </w:tc>
+        <w:tc>
+          <w:tcPr>
+            <w:tcW w:type="dxa" w:w="3135"/>
+          </w:tcPr>
+          <w:p>
+            <w:pPr>
+              <w:jc w:val="left"/>
+            </w:pPr>
+            <w:r>
+              <w:rPr>
+                <w:sz w:val="20"/>
+              </w:rPr>
+              <w:t>auditeurs avec ≥ 1 présence ÷ inscrits</w:t>
+            </w:r>
+          </w:p>
+        </w:tc>
+        <w:tc>
+          <w:tcPr>
+            <w:tcW w:type="dxa" w:w="3135"/>
+          </w:tcPr>
+          <w:p>
+            <w:pPr>
+              <w:jc w:val="left"/>
+            </w:pPr>
+            <w:r>
+              <w:rPr>
+                <w:sz w:val="20"/>
+              </w:rPr>
+              <w:t>Cartes pédagogiques, bilans CPFAE</w:t>
+            </w:r>
+          </w:p>
+        </w:tc>
+      </w:tr>
+      <w:tr>
+        <w:tc>
+          <w:tcPr>
+            <w:tcW w:type="dxa" w:w="3135"/>
+          </w:tcPr>
+          <w:p>
+            <w:pPr>
+              <w:jc w:val="left"/>
+            </w:pPr>
+            <w:r>
+              <w:rPr>
+                <w:sz w:val="20"/>
+              </w:rPr>
+              <w:t>**Absence séance**</w:t>
+            </w:r>
+          </w:p>
+        </w:tc>
+        <w:tc>
+          <w:tcPr>
+            <w:tcW w:type="dxa" w:w="3135"/>
+          </w:tcPr>
+          <w:p>
+            <w:pPr>
+              <w:jc w:val="left"/>
+            </w:pPr>
+            <w:r>
+              <w:rPr>
+                <w:sz w:val="20"/>
+              </w:rPr>
+              <w:t>places absentes ÷ places attendues</w:t>
+            </w:r>
+          </w:p>
+        </w:tc>
+        <w:tc>
+          <w:tcPr>
+            <w:tcW w:type="dxa" w:w="3135"/>
+          </w:tcPr>
+          <w:p>
+            <w:pPr>
+              <w:jc w:val="left"/>
+            </w:pPr>
+            <w:r>
+              <w:rPr>
+                <w:sz w:val="20"/>
+              </w:rPr>
+              <w:t>Cartes pédagogiques</w:t>
+            </w:r>
+          </w:p>
+        </w:tc>
+      </w:tr>
+      <w:tr>
+        <w:tc>
+          <w:tcPr>
+            <w:tcW w:type="dxa" w:w="3135"/>
+          </w:tcPr>
+          <w:p>
+            <w:pPr>
+              <w:jc w:val="left"/>
+            </w:pPr>
+            <w:r>
+              <w:rPr>
+                <w:sz w:val="20"/>
+              </w:rPr>
+              <w:t>**Événements absence / suspect**</w:t>
+            </w:r>
+          </w:p>
+        </w:tc>
+        <w:tc>
+          <w:tcPr>
+            <w:tcW w:type="dxa" w:w="3135"/>
+          </w:tcPr>
+          <w:p>
+            <w:pPr>
+              <w:jc w:val="left"/>
+            </w:pPr>
+            <w:r>
+              <w:rPr>
+                <w:sz w:val="20"/>
+              </w:rPr>
+              <w:t>pointages atypiques ÷ inscrits</w:t>
+            </w:r>
+          </w:p>
+        </w:tc>
+        <w:tc>
+          <w:tcPr>
+            <w:tcW w:type="dxa" w:w="3135"/>
+          </w:tcPr>
+          <w:p>
+            <w:pPr>
+              <w:jc w:val="left"/>
+            </w:pPr>
+            <w:r>
+              <w:rPr>
+                <w:sz w:val="20"/>
+              </w:rPr>
+              <w:t>Cartes pédagogiques, alertes (seuil configurable)</w:t>
+            </w:r>
+          </w:p>
+        </w:tc>
+      </w:tr>
+      <w:tr>
+        <w:tc>
+          <w:tcPr>
+            <w:tcW w:type="dxa" w:w="3135"/>
+          </w:tcPr>
+          <w:p>
+            <w:pPr>
+              <w:jc w:val="left"/>
+            </w:pPr>
+            <w:r>
+              <w:rPr>
+                <w:sz w:val="20"/>
+              </w:rPr>
+              <w:t>**Avancement VH (sessions clôturées)**</w:t>
+            </w:r>
+          </w:p>
+        </w:tc>
+        <w:tc>
+          <w:tcPr>
+            <w:tcW w:type="dxa" w:w="3135"/>
+          </w:tcPr>
+          <w:p>
+            <w:pPr>
+              <w:jc w:val="left"/>
+            </w:pPr>
+            <w:r>
+              <w:rPr>
+                <w:sz w:val="20"/>
+              </w:rPr>
+              <w:t>heures réalisées ÷ heures prévues</w:t>
+            </w:r>
+          </w:p>
+        </w:tc>
+        <w:tc>
+          <w:tcPr>
+            <w:tcW w:type="dxa" w:w="3135"/>
+          </w:tcPr>
+          <w:p>
+            <w:pPr>
+              <w:jc w:val="left"/>
+            </w:pPr>
+            <w:r>
+              <w:rPr>
+                <w:sz w:val="20"/>
+              </w:rPr>
+              <w:t>KPI volume horaire, alertes</w:t>
+            </w:r>
+          </w:p>
+        </w:tc>
+      </w:tr>
+    </w:tbl>
+    <w:p/>
+    <w:p>
+      <w:r>
+        <w:rPr>
+          <w:sz w:val="22"/>
+        </w:rPr>
+        <w:t>Les infobulles (icône ℹ sur les cartes KPI) décrivent chaque indicateur au survol.</w:t>
+      </w:r>
+    </w:p>
+    <w:p>
+      <w:r>
+        <w:rPr>
+          <w:b/>
+          <w:sz w:val="22"/>
+        </w:rPr>
+        <w:t>Compatibilité API :</w:t>
+      </w:r>
+      <w:r>
+        <w:rPr>
+          <w:sz w:val="22"/>
+        </w:rPr>
+        <w:t xml:space="preserve"> le champ technique `taux_achevement` reste disponible ; il correspond à </w:t>
+      </w:r>
+      <w:r>
+        <w:rPr>
+          <w:b/>
+          <w:sz w:val="22"/>
+        </w:rPr>
+        <w:t>Couverture auditeurs</w:t>
+      </w:r>
+      <w:r>
+        <w:rPr>
+          <w:sz w:val="22"/>
+        </w:rPr>
+        <w:t xml:space="preserve"> (`taux_couverture_auditeurs`).</w:t>
+      </w:r>
+    </w:p>
     <w:p>
       <w:pPr>
         <w:pStyle w:val="Heading3"/>
@@ -3302,7 +3825,7 @@
         <w:rPr>
           <w:sz w:val="22"/>
         </w:rPr>
-        <w:t>**Taux de présence**</w:t>
+        <w:t>**Assiduité séance** (anciennement « taux de présence »)</w:t>
       </w:r>
     </w:p>
     <w:p>
@@ -3313,7 +3836,7 @@
         <w:rPr>
           <w:sz w:val="22"/>
         </w:rPr>
-        <w:t>**Taux d'exécution du volume horaire**</w:t>
+        <w:t>**Avancement VH (sessions clôturées)**</w:t>
       </w:r>
     </w:p>
     <w:p>
@@ -3332,7 +3855,7 @@
         <w:rPr>
           <w:sz w:val="22"/>
         </w:rPr>
-        <w:t>Chaque jauge indique : valeur actuelle, seuils ⚠ et 🔴, niveau (Conforme / Avertissement / Critique).</w:t>
+        <w:t>Chaque jauge indique : valeur actuelle, seuils ⚠ et 🔴, niveau (Conforme / Avertissement / Critique). Une infobulle décrit le calcul de chaque indicateur.</w:t>
       </w:r>
     </w:p>
     <w:p>
@@ -3404,7 +3927,7 @@
         <w:pStyle w:val="Heading3"/>
       </w:pPr>
       <w:r>
-        <w:t>6.2 Cartes KPI (8 indicateurs)</w:t>
+        <w:t>6.2 Cartes KPI (7 indicateurs)</w:t>
       </w:r>
     </w:p>
     <w:tbl>
@@ -3756,7 +4279,7 @@
               <w:rPr>
                 <w:sz w:val="20"/>
               </w:rPr>
-              <w:t>**Pointages**</w:t>
+              <w:t>**Vol. horaire prévu**</w:t>
             </w:r>
           </w:p>
         </w:tc>
@@ -3772,7 +4295,7 @@
               <w:rPr>
                 <w:sz w:val="20"/>
               </w:rPr>
-              <w:t>Total des enregistrements de présence</w:t>
+              <w:t>Heures prévues (format `Xh`)</w:t>
             </w:r>
           </w:p>
         </w:tc>
@@ -3806,57 +4329,7 @@
               <w:rPr>
                 <w:sz w:val="20"/>
               </w:rPr>
-              <w:t>**Vol. horaire prévu**</w:t>
-            </w:r>
-          </w:p>
-        </w:tc>
-        <w:tc>
-          <w:tcPr>
-            <w:tcW w:type="dxa" w:w="3135"/>
-          </w:tcPr>
-          <w:p>
-            <w:pPr>
-              <w:jc w:val="left"/>
-            </w:pPr>
-            <w:r>
-              <w:rPr>
-                <w:sz w:val="20"/>
-              </w:rPr>
-              <w:t>Heures prévues (format `Xh`)</w:t>
-            </w:r>
-          </w:p>
-        </w:tc>
-      </w:tr>
-      <w:tr>
-        <w:tc>
-          <w:tcPr>
-            <w:tcW w:type="dxa" w:w="3135"/>
-          </w:tcPr>
-          <w:p>
-            <w:pPr>
-              <w:jc w:val="left"/>
-            </w:pPr>
-            <w:r>
-              <w:rPr>
-                <w:sz w:val="20"/>
-              </w:rPr>
-              <w:t>8</w:t>
-            </w:r>
-          </w:p>
-        </w:tc>
-        <w:tc>
-          <w:tcPr>
-            <w:tcW w:type="dxa" w:w="3135"/>
-          </w:tcPr>
-          <w:p>
-            <w:pPr>
-              <w:jc w:val="left"/>
-            </w:pPr>
-            <w:r>
-              <w:rPr>
-                <w:sz w:val="20"/>
-              </w:rPr>
-              <w:t>**Taux exéc. vol. horaire**</w:t>
+              <w:t>**Avancement VH (sessions clôturées)**</w:t>
             </w:r>
           </w:p>
         </w:tc>
@@ -3950,7 +4423,7 @@
               <w:rPr>
                 <w:sz w:val="20"/>
               </w:rPr>
-              <w:t>**Taux de présence (global)**</w:t>
+              <w:t>**Indicateurs pédagogiques**</w:t>
             </w:r>
           </w:p>
         </w:tc>
@@ -3966,41 +4439,7 @@
               <w:rPr>
                 <w:sz w:val="20"/>
               </w:rPr>
-              <w:t>4 pourcentages : Présence, Absence, Abandon, Achèvement</w:t>
-            </w:r>
-          </w:p>
-        </w:tc>
-      </w:tr>
-      <w:tr>
-        <w:tc>
-          <w:tcPr>
-            <w:tcW w:type="dxa" w:w="4703"/>
-          </w:tcPr>
-          <w:p>
-            <w:pPr>
-              <w:jc w:val="left"/>
-            </w:pPr>
-            <w:r>
-              <w:rPr>
-                <w:sz w:val="20"/>
-              </w:rPr>
-              <w:t>**Pointages par statut**</w:t>
-            </w:r>
-          </w:p>
-        </w:tc>
-        <w:tc>
-          <w:tcPr>
-            <w:tcW w:type="dxa" w:w="4703"/>
-          </w:tcPr>
-          <w:p>
-            <w:pPr>
-              <w:jc w:val="left"/>
-            </w:pPr>
-            <w:r>
-              <w:rPr>
-                <w:sz w:val="20"/>
-              </w:rPr>
-              <w:t>Diagramme circulaire (donut)</w:t>
+              <w:t>Deux cartes principales (**Assiduité séance**, **Couverture auditeurs**) puis les quatre taux détaillés</w:t>
             </w:r>
           </w:p>
         </w:tc>
@@ -4257,7 +4696,7 @@
               <w:rPr>
                 <w:sz w:val="20"/>
               </w:rPr>
-              <w:t>**Abandons**</w:t>
+              <w:t>**Événements**</w:t>
             </w:r>
           </w:p>
         </w:tc>
@@ -4273,7 +4712,7 @@
               <w:rPr>
                 <w:sz w:val="20"/>
               </w:rPr>
-              <w:t>Abandons enregistrés</w:t>
+              <w:t>Pointages « absent non badgé » ou « hors ligne suspect »</w:t>
             </w:r>
           </w:p>
         </w:tc>
@@ -4291,7 +4730,7 @@
               <w:rPr>
                 <w:sz w:val="20"/>
               </w:rPr>
-              <w:t>**Taux présence / absence / abandon / achèvement**</w:t>
+              <w:t>**Assiduité séance**</w:t>
             </w:r>
           </w:p>
         </w:tc>
@@ -4307,13 +4746,149 @@
               <w:rPr>
                 <w:sz w:val="20"/>
               </w:rPr>
-              <w:t>Pourcentages calculés sur l'effectif</w:t>
+              <w:t>Places présentes ÷ places attendues (séances terminées)</w:t>
+            </w:r>
+          </w:p>
+        </w:tc>
+      </w:tr>
+      <w:tr>
+        <w:tc>
+          <w:tcPr>
+            <w:tcW w:type="dxa" w:w="4703"/>
+          </w:tcPr>
+          <w:p>
+            <w:pPr>
+              <w:jc w:val="left"/>
+            </w:pPr>
+            <w:r>
+              <w:rPr>
+                <w:sz w:val="20"/>
+              </w:rPr>
+              <w:t>**Couverture auditeurs**</w:t>
+            </w:r>
+          </w:p>
+        </w:tc>
+        <w:tc>
+          <w:tcPr>
+            <w:tcW w:type="dxa" w:w="4703"/>
+          </w:tcPr>
+          <w:p>
+            <w:pPr>
+              <w:jc w:val="left"/>
+            </w:pPr>
+            <w:r>
+              <w:rPr>
+                <w:sz w:val="20"/>
+              </w:rPr>
+              <w:t>Auditeurs avec ≥ 1 présence ÷ inscrits</w:t>
+            </w:r>
+          </w:p>
+        </w:tc>
+      </w:tr>
+      <w:tr>
+        <w:tc>
+          <w:tcPr>
+            <w:tcW w:type="dxa" w:w="4703"/>
+          </w:tcPr>
+          <w:p>
+            <w:pPr>
+              <w:jc w:val="left"/>
+            </w:pPr>
+            <w:r>
+              <w:rPr>
+                <w:sz w:val="20"/>
+              </w:rPr>
+              <w:t>**Absence séance**</w:t>
+            </w:r>
+          </w:p>
+        </w:tc>
+        <w:tc>
+          <w:tcPr>
+            <w:tcW w:type="dxa" w:w="4703"/>
+          </w:tcPr>
+          <w:p>
+            <w:pPr>
+              <w:jc w:val="left"/>
+            </w:pPr>
+            <w:r>
+              <w:rPr>
+                <w:sz w:val="20"/>
+              </w:rPr>
+              <w:t>Places absentes ÷ places attendues</w:t>
+            </w:r>
+          </w:p>
+        </w:tc>
+      </w:tr>
+      <w:tr>
+        <w:tc>
+          <w:tcPr>
+            <w:tcW w:type="dxa" w:w="4703"/>
+          </w:tcPr>
+          <w:p>
+            <w:pPr>
+              <w:jc w:val="left"/>
+            </w:pPr>
+            <w:r>
+              <w:rPr>
+                <w:sz w:val="20"/>
+              </w:rPr>
+              <w:t>**Événements absence / suspect**</w:t>
+            </w:r>
+          </w:p>
+        </w:tc>
+        <w:tc>
+          <w:tcPr>
+            <w:tcW w:type="dxa" w:w="4703"/>
+          </w:tcPr>
+          <w:p>
+            <w:pPr>
+              <w:jc w:val="left"/>
+            </w:pPr>
+            <w:r>
+              <w:rPr>
+                <w:sz w:val="20"/>
+              </w:rPr>
+              <w:t>Événements atypiques ÷ inscrits</w:t>
             </w:r>
           </w:p>
         </w:tc>
       </w:tr>
     </w:tbl>
     <w:p/>
+    <w:p>
+      <w:r>
+        <w:rPr>
+          <w:sz w:val="22"/>
+        </w:rPr>
+        <w:t xml:space="preserve">Les cartes </w:t>
+      </w:r>
+      <w:r>
+        <w:rPr>
+          <w:b/>
+          <w:sz w:val="22"/>
+        </w:rPr>
+        <w:t>Assiduité séance</w:t>
+      </w:r>
+      <w:r>
+        <w:rPr>
+          <w:sz w:val="22"/>
+        </w:rPr>
+        <w:t xml:space="preserve"> et </w:t>
+      </w:r>
+      <w:r>
+        <w:rPr>
+          <w:b/>
+          <w:sz w:val="22"/>
+        </w:rPr>
+        <w:t>Couverture auditeurs</w:t>
+      </w:r>
+      <w:r>
+        <w:rPr>
+          <w:sz w:val="22"/>
+        </w:rPr>
+        <w:t xml:space="preserve"> sont mises en avant côte à côte en tête de l'onglet.</w:t>
+      </w:r>
+    </w:p>
     <w:p>
       <w:pPr>
         <w:pStyle w:val="Heading3"/>
@@ -4385,7 +4960,7 @@
               <w:rPr>
                 <w:sz w:val="20"/>
               </w:rPr>
-              <w:t>**Taux de présence par formation (10 der.)**</w:t>
+              <w:t>**Assiduité séance par formation (10 der.)**</w:t>
             </w:r>
           </w:p>
         </w:tc>
@@ -4419,7 +4994,7 @@
               <w:rPr>
                 <w:sz w:val="20"/>
               </w:rPr>
-              <w:t>**Taux de présence par grade**</w:t>
+              <w:t>**Assiduité séance par grade**</w:t>
             </w:r>
           </w:p>
         </w:tc>
@@ -4487,7 +5062,7 @@
               <w:rPr>
                 <w:sz w:val="20"/>
               </w:rPr>
-              <w:t>**Taux de présence par secrétariat**</w:t>
+              <w:t>**Assiduité séance par secrétariat**</w:t>
             </w:r>
           </w:p>
         </w:tc>
@@ -8176,14 +8751,14 @@
         <w:rPr>
           <w:sz w:val="22"/>
         </w:rPr>
-        <w:t xml:space="preserve"> : un tableau par </w:t>
+        <w:t xml:space="preserve"> (modèle Excel « POINT JOURNALIER CAT A ») : un tableau par </w:t>
       </w:r>
       <w:r>
         <w:rPr>
           <w:b/>
           <w:sz w:val="22"/>
         </w:rPr>
-        <w:t>journée × catégorie × formation</w:t>
+        <w:t>journée × catégorie × formation × grade</w:t>
       </w:r>
       <w:r>
         <w:rPr>
@@ -8202,7 +8777,7 @@
         <w:rPr>
           <w:sz w:val="22"/>
         </w:rPr>
-        <w:t xml:space="preserve"> et </w:t>
+        <w:t xml:space="preserve"> (08H00-12H00) et </w:t>
       </w:r>
       <w:r>
         <w:rPr>
@@ -8215,7 +8790,7 @@
         <w:rPr>
           <w:sz w:val="22"/>
         </w:rPr>
-        <w:t>.</w:t>
+        <w:t xml:space="preserve"> (13H00-17H00).</w:t>
       </w:r>
     </w:p>
     <w:p>
@@ -8287,7 +8862,283 @@
         <w:pStyle w:val="Heading3"/>
       </w:pPr>
       <w:r>
-        <w:t>12.1 Filtres</w:t>
+        <w:t>12.1 Structure du tableau (modèle FAC)</w:t>
+      </w:r>
+    </w:p>
+    <w:tbl>
+      <w:tblPr>
+        <w:tblStyle w:val="TableGrid"/>
+        <w:tblW w:type="auto" w:w="0"/>
+        <w:tblLook w:firstColumn="1" w:firstRow="1" w:lastColumn="0" w:lastRow="0" w:noHBand="0" w:noVBand="1" w:val="04A0"/>
+      </w:tblPr>
+      <w:tblGrid>
+        <w:gridCol w:w="4703"/>
+        <w:gridCol w:w="4703"/>
+      </w:tblGrid>
+      <w:tr>
+        <w:tc>
+          <w:tcPr>
+            <w:tcW w:type="dxa" w:w="4703"/>
+            <w:shd w:fill="43A047" w:val="clear"/>
+          </w:tcPr>
+          <w:p>
+            <w:pPr>
+              <w:jc w:val="center"/>
+            </w:pPr>
+            <w:r>
+              <w:rPr>
+                <w:b/>
+                <w:color w:val="FFFFFF"/>
+                <w:sz w:val="18"/>
+              </w:rPr>
+              <w:t>Zone</w:t>
+            </w:r>
+          </w:p>
+        </w:tc>
+        <w:tc>
+          <w:tcPr>
+            <w:tcW w:type="dxa" w:w="4703"/>
+            <w:shd w:fill="43A047" w:val="clear"/>
+          </w:tcPr>
+          <w:p>
+            <w:pPr>
+              <w:jc w:val="center"/>
+            </w:pPr>
+            <w:r>
+              <w:rPr>
+                <w:b/>
+                <w:color w:val="FFFFFF"/>
+                <w:sz w:val="18"/>
+              </w:rPr>
+              <w:t>Contenu</w:t>
+            </w:r>
+          </w:p>
+        </w:tc>
+      </w:tr>
+      <w:tr>
+        <w:tc>
+          <w:tcPr>
+            <w:tcW w:type="dxa" w:w="4703"/>
+          </w:tcPr>
+          <w:p>
+            <w:pPr>
+              <w:jc w:val="left"/>
+            </w:pPr>
+            <w:r>
+              <w:rPr>
+                <w:sz w:val="20"/>
+              </w:rPr>
+              <w:t>**Ligne 1**</w:t>
+            </w:r>
+          </w:p>
+        </w:tc>
+        <w:tc>
+          <w:tcPr>
+            <w:tcW w:type="dxa" w:w="4703"/>
+          </w:tcPr>
+          <w:p>
+            <w:pPr>
+              <w:jc w:val="left"/>
+            </w:pPr>
+            <w:r>
+              <w:rPr>
+                <w:sz w:val="20"/>
+              </w:rPr>
+              <w:t>`FORMATION D'ACCOMPAGNEMENT DE CARRIER CAT A _POINT DES PRÉSENCES_CPFAE` (orange)</w:t>
+            </w:r>
+          </w:p>
+        </w:tc>
+      </w:tr>
+      <w:tr>
+        <w:tc>
+          <w:tcPr>
+            <w:tcW w:type="dxa" w:w="4703"/>
+          </w:tcPr>
+          <w:p>
+            <w:pPr>
+              <w:jc w:val="left"/>
+            </w:pPr>
+            <w:r>
+              <w:rPr>
+                <w:sz w:val="20"/>
+              </w:rPr>
+              <w:t>**Ligne 2**</w:t>
+            </w:r>
+          </w:p>
+        </w:tc>
+        <w:tc>
+          <w:tcPr>
+            <w:tcW w:type="dxa" w:w="4703"/>
+          </w:tcPr>
+          <w:p>
+            <w:pPr>
+              <w:jc w:val="left"/>
+            </w:pPr>
+            <w:r>
+              <w:rPr>
+                <w:sz w:val="20"/>
+              </w:rPr>
+              <w:t>DATE · jour · mois · année · `CATÉGORIE A_GRADE A3`</w:t>
+            </w:r>
+          </w:p>
+        </w:tc>
+      </w:tr>
+      <w:tr>
+        <w:tc>
+          <w:tcPr>
+            <w:tcW w:type="dxa" w:w="4703"/>
+          </w:tcPr>
+          <w:p>
+            <w:pPr>
+              <w:jc w:val="left"/>
+            </w:pPr>
+            <w:r>
+              <w:rPr>
+                <w:sz w:val="20"/>
+              </w:rPr>
+              <w:t>**Bande droite**</w:t>
+            </w:r>
+          </w:p>
+        </w:tc>
+        <w:tc>
+          <w:tcPr>
+            <w:tcW w:type="dxa" w:w="4703"/>
+          </w:tcPr>
+          <w:p>
+            <w:pPr>
+              <w:jc w:val="left"/>
+            </w:pPr>
+            <w:r>
+              <w:rPr>
+                <w:sz w:val="20"/>
+              </w:rPr>
+              <w:t>Libellé vague (ex. **SECONDE VAGUE**, fond jaune)</w:t>
+            </w:r>
+          </w:p>
+        </w:tc>
+      </w:tr>
+      <w:tr>
+        <w:tc>
+          <w:tcPr>
+            <w:tcW w:type="dxa" w:w="4703"/>
+          </w:tcPr>
+          <w:p>
+            <w:pPr>
+              <w:jc w:val="left"/>
+            </w:pPr>
+            <w:r>
+              <w:rPr>
+                <w:sz w:val="20"/>
+              </w:rPr>
+              <w:t>**MATIN / SOIR**</w:t>
+            </w:r>
+          </w:p>
+        </w:tc>
+        <w:tc>
+          <w:tcPr>
+            <w:tcW w:type="dxa" w:w="4703"/>
+          </w:tcPr>
+          <w:p>
+            <w:pPr>
+              <w:jc w:val="left"/>
+            </w:pPr>
+            <w:r>
+              <w:rPr>
+                <w:sz w:val="20"/>
+              </w:rPr>
+              <w:t>GROUPES (G7, G8…), SALLES (région/district), effectifs, taux</w:t>
+            </w:r>
+          </w:p>
+        </w:tc>
+      </w:tr>
+      <w:tr>
+        <w:tc>
+          <w:tcPr>
+            <w:tcW w:type="dxa" w:w="4703"/>
+          </w:tcPr>
+          <w:p>
+            <w:pPr>
+              <w:jc w:val="left"/>
+            </w:pPr>
+            <w:r>
+              <w:rPr>
+                <w:sz w:val="20"/>
+              </w:rPr>
+              <w:t>**Colonne TOTAL**</w:t>
+            </w:r>
+          </w:p>
+        </w:tc>
+        <w:tc>
+          <w:tcPr>
+            <w:tcW w:type="dxa" w:w="4703"/>
+          </w:tcPr>
+          <w:p>
+            <w:pPr>
+              <w:jc w:val="left"/>
+            </w:pPr>
+            <w:r>
+              <w:rPr>
+                <w:sz w:val="20"/>
+              </w:rPr>
+              <w:t>Sommes et taux globaux du créneau (fond jaune)</w:t>
+            </w:r>
+          </w:p>
+        </w:tc>
+      </w:tr>
+      <w:tr>
+        <w:tc>
+          <w:tcPr>
+            <w:tcW w:type="dxa" w:w="4703"/>
+          </w:tcPr>
+          <w:p>
+            <w:pPr>
+              <w:jc w:val="left"/>
+            </w:pPr>
+            <w:r>
+              <w:rPr>
+                <w:sz w:val="20"/>
+              </w:rPr>
+              <w:t>**Pied**</w:t>
+            </w:r>
+          </w:p>
+        </w:tc>
+        <w:tc>
+          <w:tcPr>
+            <w:tcW w:type="dxa" w:w="4703"/>
+          </w:tcPr>
+          <w:p>
+            <w:pPr>
+              <w:jc w:val="left"/>
+            </w:pPr>
+            <w:r>
+              <w:rPr>
+                <w:sz w:val="20"/>
+              </w:rPr>
+              <w:t>Taux de présence du jour · Taux d'absence du jour</w:t>
+            </w:r>
+          </w:p>
+        </w:tc>
+      </w:tr>
+    </w:tbl>
+    <w:p/>
+    <w:p>
+      <w:pPr>
+        <w:ind w:left="283"/>
+      </w:pPr>
+      <w:r>
+        <w:rPr>
+          <w:i/>
+          <w:color w:val="64748B"/>
+        </w:rPr>
+        <w:t>**Export Excel :** une feuille par grade (ex. feuilles **A3**, **A4**) pour une même catégorie.</w:t>
+      </w:r>
+    </w:p>
+    <w:p>
+      <w:pPr>
+        <w:pStyle w:val="Heading3"/>
+      </w:pPr>
+      <w:r>
+        <w:t>12.2 Filtres</w:t>
       </w:r>
     </w:p>
     <w:tbl>
@@ -8556,7 +9407,7 @@
         <w:pStyle w:val="Heading3"/>
       </w:pPr>
       <w:r>
-        <w:t>12.2 Navigation</w:t>
+        <w:t>12.3 Navigation</w:t>
       </w:r>
     </w:p>
     <w:tbl>
@@ -8696,7 +9547,7 @@
         <w:pStyle w:val="Heading3"/>
       </w:pPr>
       <w:r>
-        <w:t>12.3 Contenu d'un point journalier</w:t>
+        <w:t>12.4 Contenu d'un point journalier</w:t>
       </w:r>
     </w:p>
     <w:p>
@@ -8989,7 +9840,7 @@
         <w:pStyle w:val="Heading3"/>
       </w:pPr>
       <w:r>
-        <w:t>12.4 Exports Point Journalier</w:t>
+        <w:t>12.5 Exports Point Journalier</w:t>
       </w:r>
     </w:p>
     <w:tbl>
@@ -10972,6 +11823,156 @@
                 <w:sz w:val="20"/>
               </w:rPr>
               <w:t>Manuel détaillé complet : bilans CPFAE (module, catégorie, formation), exports Excel/PDF/Word bilans et PJ, alertes visuelles, suppression section « Rapports générés », captures d'écran intégrées</w:t>
+            </w:r>
+          </w:p>
+        </w:tc>
+      </w:tr>
+      <w:tr>
+        <w:tc>
+          <w:tcPr>
+            <w:tcW w:type="dxa" w:w="3135"/>
+          </w:tcPr>
+          <w:p>
+            <w:pPr>
+              <w:jc w:val="left"/>
+            </w:pPr>
+            <w:r>
+              <w:rPr>
+                <w:sz w:val="20"/>
+              </w:rPr>
+              <w:t>2.0.1</w:t>
+            </w:r>
+          </w:p>
+        </w:tc>
+        <w:tc>
+          <w:tcPr>
+            <w:tcW w:type="dxa" w:w="3135"/>
+          </w:tcPr>
+          <w:p>
+            <w:pPr>
+              <w:jc w:val="left"/>
+            </w:pPr>
+            <w:r>
+              <w:rPr>
+                <w:sz w:val="20"/>
+              </w:rPr>
+              <w:t>05/06/2026</w:t>
+            </w:r>
+          </w:p>
+        </w:tc>
+        <w:tc>
+          <w:tcPr>
+            <w:tcW w:type="dxa" w:w="3135"/>
+          </w:tcPr>
+          <w:p>
+            <w:pPr>
+              <w:jc w:val="left"/>
+            </w:pPr>
+            <w:r>
+              <w:rPr>
+                <w:sz w:val="20"/>
+              </w:rPr>
+              <w:t>Vue d'ensemble : retrait des widgets Pointages et Pointages par statut</w:t>
+            </w:r>
+          </w:p>
+        </w:tc>
+      </w:tr>
+      <w:tr>
+        <w:tc>
+          <w:tcPr>
+            <w:tcW w:type="dxa" w:w="3135"/>
+          </w:tcPr>
+          <w:p>
+            <w:pPr>
+              <w:jc w:val="left"/>
+            </w:pPr>
+            <w:r>
+              <w:rPr>
+                <w:sz w:val="20"/>
+              </w:rPr>
+              <w:t>2.1.0</w:t>
+            </w:r>
+          </w:p>
+        </w:tc>
+        <w:tc>
+          <w:tcPr>
+            <w:tcW w:type="dxa" w:w="3135"/>
+          </w:tcPr>
+          <w:p>
+            <w:pPr>
+              <w:jc w:val="left"/>
+            </w:pPr>
+            <w:r>
+              <w:rPr>
+                <w:sz w:val="20"/>
+              </w:rPr>
+              <w:t>08/06/2026</w:t>
+            </w:r>
+          </w:p>
+        </w:tc>
+        <w:tc>
+          <w:tcPr>
+            <w:tcW w:type="dxa" w:w="3135"/>
+          </w:tcPr>
+          <w:p>
+            <w:pPr>
+              <w:jc w:val="left"/>
+            </w:pPr>
+            <w:r>
+              <w:rPr>
+                <w:sz w:val="20"/>
+              </w:rPr>
+              <w:t>Harmonisation des libellés (assiduité séance, couverture auditeurs, événements absence/suspect, avancement VH), bandeau explicatif sous les filtres, infobulles KPI, champ API `taux_couverture_auditeurs`, §5.1 « Comment lire les chiffres »</w:t>
+            </w:r>
+          </w:p>
+        </w:tc>
+      </w:tr>
+      <w:tr>
+        <w:tc>
+          <w:tcPr>
+            <w:tcW w:type="dxa" w:w="3135"/>
+          </w:tcPr>
+          <w:p>
+            <w:pPr>
+              <w:jc w:val="left"/>
+            </w:pPr>
+            <w:r>
+              <w:rPr>
+                <w:sz w:val="20"/>
+              </w:rPr>
+              <w:t>2.2.0</w:t>
+            </w:r>
+          </w:p>
+        </w:tc>
+        <w:tc>
+          <w:tcPr>
+            <w:tcW w:type="dxa" w:w="3135"/>
+          </w:tcPr>
+          <w:p>
+            <w:pPr>
+              <w:jc w:val="left"/>
+            </w:pPr>
+            <w:r>
+              <w:rPr>
+                <w:sz w:val="20"/>
+              </w:rPr>
+              <w:t>11/06/2026</w:t>
+            </w:r>
+          </w:p>
+        </w:tc>
+        <w:tc>
+          <w:tcPr>
+            <w:tcW w:type="dxa" w:w="3135"/>
+          </w:tcPr>
+          <w:p>
+            <w:pPr>
+              <w:jc w:val="left"/>
+            </w:pPr>
+            <w:r>
+              <w:rPr>
+                <w:sz w:val="20"/>
+              </w:rPr>
+              <w:t>Point journalier aligné modèle Excel FAC 2025 : titre par catégorie, feuille par grade, visuel web CPFAE (orange/jaune), colonne TOTAL et bande vague</w:t>
             </w:r>
           </w:p>
         </w:tc>

</xml_diff>

<commit_message>
Sauvegarde travail local avant recuperation origin main
</commit_message>
<xml_diff>
--- a/docs/Manuel utilisateur App Statistiques.docx
+++ b/docs/Manuel utilisateur App Statistiques.docx
@@ -154,7 +154,7 @@
               <w:rPr>
                 <w:sz w:val="20"/>
               </w:rPr>
-              <w:t>2.1.0</w:t>
+              <w:t>2.0.1</w:t>
             </w:r>
           </w:p>
         </w:tc>
@@ -188,7 +188,7 @@
               <w:rPr>
                 <w:sz w:val="20"/>
               </w:rPr>
-              <w:t>08/06/2026</w:t>
+              <w:t>05/06/2026</w:t>
             </w:r>
           </w:p>
         </w:tc>
@@ -2815,7 +2815,7 @@
               <w:rPr>
                 <w:sz w:val="20"/>
               </w:rPr>
-              <w:t>Absent non badgé, suivi spécifique CPFAE</w:t>
+              <w:t>Inscrit à un module démarré, sans aucune présence enregistrée (ou motif notoire renseigné)</w:t>
             </w:r>
           </w:p>
         </w:tc>
@@ -2986,535 +2986,12 @@
                 <w:sz w:val="20"/>
               </w:rPr>
               <w:t>Palier nécessitant une action corrective</w:t>
-            </w:r>
-          </w:p>
-        </w:tc>
-      </w:tr>
-      <w:tr>
-        <w:tc>
-          <w:tcPr>
-            <w:tcW w:type="dxa" w:w="4703"/>
-          </w:tcPr>
-          <w:p>
-            <w:pPr>
-              <w:jc w:val="left"/>
-            </w:pPr>
-            <w:r>
-              <w:rPr>
-                <w:sz w:val="20"/>
-              </w:rPr>
-              <w:t>**Assiduité séance**</w:t>
-            </w:r>
-          </w:p>
-        </w:tc>
-        <w:tc>
-          <w:tcPr>
-            <w:tcW w:type="dxa" w:w="4703"/>
-          </w:tcPr>
-          <w:p>
-            <w:pPr>
-              <w:jc w:val="left"/>
-            </w:pPr>
-            <w:r>
-              <w:rPr>
-                <w:sz w:val="20"/>
-              </w:rPr>
-              <w:t>Places présentes ÷ places attendues sur les séances terminées (dashboard, alertes, historique)</w:t>
-            </w:r>
-          </w:p>
-        </w:tc>
-      </w:tr>
-      <w:tr>
-        <w:tc>
-          <w:tcPr>
-            <w:tcW w:type="dxa" w:w="4703"/>
-          </w:tcPr>
-          <w:p>
-            <w:pPr>
-              <w:jc w:val="left"/>
-            </w:pPr>
-            <w:r>
-              <w:rPr>
-                <w:sz w:val="20"/>
-              </w:rPr>
-              <w:t>**Couverture auditeurs**</w:t>
-            </w:r>
-          </w:p>
-        </w:tc>
-        <w:tc>
-          <w:tcPr>
-            <w:tcW w:type="dxa" w:w="4703"/>
-          </w:tcPr>
-          <w:p>
-            <w:pPr>
-              <w:jc w:val="left"/>
-            </w:pPr>
-            <w:r>
-              <w:rPr>
-                <w:sz w:val="20"/>
-              </w:rPr>
-              <w:t>Auditeurs avec ≥ 1 présence ÷ inscrits (logique des bilans CPFAE)</w:t>
-            </w:r>
-          </w:p>
-        </w:tc>
-      </w:tr>
-      <w:tr>
-        <w:tc>
-          <w:tcPr>
-            <w:tcW w:type="dxa" w:w="4703"/>
-          </w:tcPr>
-          <w:p>
-            <w:pPr>
-              <w:jc w:val="left"/>
-            </w:pPr>
-            <w:r>
-              <w:rPr>
-                <w:sz w:val="20"/>
-              </w:rPr>
-              <w:t>**Événements absence / suspect**</w:t>
-            </w:r>
-          </w:p>
-        </w:tc>
-        <w:tc>
-          <w:tcPr>
-            <w:tcW w:type="dxa" w:w="4703"/>
-          </w:tcPr>
-          <w:p>
-            <w:pPr>
-              <w:jc w:val="left"/>
-            </w:pPr>
-            <w:r>
-              <w:rPr>
-                <w:sz w:val="20"/>
-              </w:rPr>
-              <w:t>Pointages « absent non badgé » ou « hors ligne suspect » rapportés aux inscrits</w:t>
-            </w:r>
-          </w:p>
-        </w:tc>
-      </w:tr>
-      <w:tr>
-        <w:tc>
-          <w:tcPr>
-            <w:tcW w:type="dxa" w:w="4703"/>
-          </w:tcPr>
-          <w:p>
-            <w:pPr>
-              <w:jc w:val="left"/>
-            </w:pPr>
-            <w:r>
-              <w:rPr>
-                <w:sz w:val="20"/>
-              </w:rPr>
-              <w:t>**Avancement VH (sessions clôturées)**</w:t>
-            </w:r>
-          </w:p>
-        </w:tc>
-        <w:tc>
-          <w:tcPr>
-            <w:tcW w:type="dxa" w:w="4703"/>
-          </w:tcPr>
-          <w:p>
-            <w:pPr>
-              <w:jc w:val="left"/>
-            </w:pPr>
-            <w:r>
-              <w:rPr>
-                <w:sz w:val="20"/>
-              </w:rPr>
-              <w:t>Heures réalisées ÷ heures prévues sur les séances clôturées du périmètre</w:t>
             </w:r>
           </w:p>
         </w:tc>
       </w:tr>
     </w:tbl>
     <w:p/>
-    <w:p>
-      <w:pPr>
-        <w:pStyle w:val="Heading3"/>
-      </w:pPr>
-      <w:r>
-        <w:t>5.1 Comment lire les chiffres</w:t>
-      </w:r>
-    </w:p>
-    <w:p>
-      <w:r>
-        <w:rPr>
-          <w:sz w:val="22"/>
-        </w:rPr>
-        <w:t xml:space="preserve">Deux logiques de taux coexistent dans le module. Un </w:t>
-      </w:r>
-      <w:r>
-        <w:rPr>
-          <w:b/>
-          <w:sz w:val="22"/>
-        </w:rPr>
-        <w:t>bandeau explicatif</w:t>
-      </w:r>
-      <w:r>
-        <w:rPr>
-          <w:sz w:val="22"/>
-        </w:rPr>
-        <w:t xml:space="preserve"> sous les filtres rappelle cette distinction à chaque visite.</w:t>
-      </w:r>
-    </w:p>
-    <w:tbl>
-      <w:tblPr>
-        <w:tblStyle w:val="TableGrid"/>
-        <w:tblW w:type="auto" w:w="0"/>
-        <w:tblLook w:firstColumn="1" w:firstRow="1" w:lastColumn="0" w:lastRow="0" w:noHBand="0" w:noVBand="1" w:val="04A0"/>
-      </w:tblPr>
-      <w:tblGrid>
-        <w:gridCol w:w="3135"/>
-        <w:gridCol w:w="3135"/>
-        <w:gridCol w:w="3135"/>
-      </w:tblGrid>
-      <w:tr>
-        <w:tc>
-          <w:tcPr>
-            <w:tcW w:type="dxa" w:w="3135"/>
-            <w:shd w:fill="43A047" w:val="clear"/>
-          </w:tcPr>
-          <w:p>
-            <w:pPr>
-              <w:jc w:val="center"/>
-            </w:pPr>
-            <w:r>
-              <w:rPr>
-                <w:b/>
-                <w:color w:val="FFFFFF"/>
-                <w:sz w:val="18"/>
-              </w:rPr>
-              <w:t>Indicateur affiché</w:t>
-            </w:r>
-          </w:p>
-        </w:tc>
-        <w:tc>
-          <w:tcPr>
-            <w:tcW w:type="dxa" w:w="3135"/>
-            <w:shd w:fill="43A047" w:val="clear"/>
-          </w:tcPr>
-          <w:p>
-            <w:pPr>
-              <w:jc w:val="center"/>
-            </w:pPr>
-            <w:r>
-              <w:rPr>
-                <w:b/>
-                <w:color w:val="FFFFFF"/>
-                <w:sz w:val="18"/>
-              </w:rPr>
-              <w:t>Formule</w:t>
-            </w:r>
-          </w:p>
-        </w:tc>
-        <w:tc>
-          <w:tcPr>
-            <w:tcW w:type="dxa" w:w="3135"/>
-            <w:shd w:fill="43A047" w:val="clear"/>
-          </w:tcPr>
-          <w:p>
-            <w:pPr>
-              <w:jc w:val="center"/>
-            </w:pPr>
-            <w:r>
-              <w:rPr>
-                <w:b/>
-                <w:color w:val="FFFFFF"/>
-                <w:sz w:val="18"/>
-              </w:rPr>
-              <w:t>Où le trouver</w:t>
-            </w:r>
-          </w:p>
-        </w:tc>
-      </w:tr>
-      <w:tr>
-        <w:tc>
-          <w:tcPr>
-            <w:tcW w:type="dxa" w:w="3135"/>
-          </w:tcPr>
-          <w:p>
-            <w:pPr>
-              <w:jc w:val="left"/>
-            </w:pPr>
-            <w:r>
-              <w:rPr>
-                <w:sz w:val="20"/>
-              </w:rPr>
-              <w:t>**Assiduité séance**</w:t>
-            </w:r>
-          </w:p>
-        </w:tc>
-        <w:tc>
-          <w:tcPr>
-            <w:tcW w:type="dxa" w:w="3135"/>
-          </w:tcPr>
-          <w:p>
-            <w:pPr>
-              <w:jc w:val="left"/>
-            </w:pPr>
-            <w:r>
-              <w:rPr>
-                <w:sz w:val="20"/>
-              </w:rPr>
-              <w:t>places présentes ÷ places attendues (séances terminées)</w:t>
-            </w:r>
-          </w:p>
-        </w:tc>
-        <w:tc>
-          <w:tcPr>
-            <w:tcW w:type="dxa" w:w="3135"/>
-          </w:tcPr>
-          <w:p>
-            <w:pPr>
-              <w:jc w:val="left"/>
-            </w:pPr>
-            <w:r>
-              <w:rPr>
-                <w:sz w:val="20"/>
-              </w:rPr>
-              <w:t>Vue d'ensemble, alertes, historique, tableaux « par formation / grade / secrétariat »</w:t>
-            </w:r>
-          </w:p>
-        </w:tc>
-      </w:tr>
-      <w:tr>
-        <w:tc>
-          <w:tcPr>
-            <w:tcW w:type="dxa" w:w="3135"/>
-          </w:tcPr>
-          <w:p>
-            <w:pPr>
-              <w:jc w:val="left"/>
-            </w:pPr>
-            <w:r>
-              <w:rPr>
-                <w:sz w:val="20"/>
-              </w:rPr>
-              <w:t>**Couverture auditeurs**</w:t>
-            </w:r>
-          </w:p>
-        </w:tc>
-        <w:tc>
-          <w:tcPr>
-            <w:tcW w:type="dxa" w:w="3135"/>
-          </w:tcPr>
-          <w:p>
-            <w:pPr>
-              <w:jc w:val="left"/>
-            </w:pPr>
-            <w:r>
-              <w:rPr>
-                <w:sz w:val="20"/>
-              </w:rPr>
-              <w:t>auditeurs avec ≥ 1 présence ÷ inscrits</w:t>
-            </w:r>
-          </w:p>
-        </w:tc>
-        <w:tc>
-          <w:tcPr>
-            <w:tcW w:type="dxa" w:w="3135"/>
-          </w:tcPr>
-          <w:p>
-            <w:pPr>
-              <w:jc w:val="left"/>
-            </w:pPr>
-            <w:r>
-              <w:rPr>
-                <w:sz w:val="20"/>
-              </w:rPr>
-              <w:t>Cartes pédagogiques, bilans CPFAE</w:t>
-            </w:r>
-          </w:p>
-        </w:tc>
-      </w:tr>
-      <w:tr>
-        <w:tc>
-          <w:tcPr>
-            <w:tcW w:type="dxa" w:w="3135"/>
-          </w:tcPr>
-          <w:p>
-            <w:pPr>
-              <w:jc w:val="left"/>
-            </w:pPr>
-            <w:r>
-              <w:rPr>
-                <w:sz w:val="20"/>
-              </w:rPr>
-              <w:t>**Absence séance**</w:t>
-            </w:r>
-          </w:p>
-        </w:tc>
-        <w:tc>
-          <w:tcPr>
-            <w:tcW w:type="dxa" w:w="3135"/>
-          </w:tcPr>
-          <w:p>
-            <w:pPr>
-              <w:jc w:val="left"/>
-            </w:pPr>
-            <w:r>
-              <w:rPr>
-                <w:sz w:val="20"/>
-              </w:rPr>
-              <w:t>places absentes ÷ places attendues</w:t>
-            </w:r>
-          </w:p>
-        </w:tc>
-        <w:tc>
-          <w:tcPr>
-            <w:tcW w:type="dxa" w:w="3135"/>
-          </w:tcPr>
-          <w:p>
-            <w:pPr>
-              <w:jc w:val="left"/>
-            </w:pPr>
-            <w:r>
-              <w:rPr>
-                <w:sz w:val="20"/>
-              </w:rPr>
-              <w:t>Cartes pédagogiques</w:t>
-            </w:r>
-          </w:p>
-        </w:tc>
-      </w:tr>
-      <w:tr>
-        <w:tc>
-          <w:tcPr>
-            <w:tcW w:type="dxa" w:w="3135"/>
-          </w:tcPr>
-          <w:p>
-            <w:pPr>
-              <w:jc w:val="left"/>
-            </w:pPr>
-            <w:r>
-              <w:rPr>
-                <w:sz w:val="20"/>
-              </w:rPr>
-              <w:t>**Événements absence / suspect**</w:t>
-            </w:r>
-          </w:p>
-        </w:tc>
-        <w:tc>
-          <w:tcPr>
-            <w:tcW w:type="dxa" w:w="3135"/>
-          </w:tcPr>
-          <w:p>
-            <w:pPr>
-              <w:jc w:val="left"/>
-            </w:pPr>
-            <w:r>
-              <w:rPr>
-                <w:sz w:val="20"/>
-              </w:rPr>
-              <w:t>pointages atypiques ÷ inscrits</w:t>
-            </w:r>
-          </w:p>
-        </w:tc>
-        <w:tc>
-          <w:tcPr>
-            <w:tcW w:type="dxa" w:w="3135"/>
-          </w:tcPr>
-          <w:p>
-            <w:pPr>
-              <w:jc w:val="left"/>
-            </w:pPr>
-            <w:r>
-              <w:rPr>
-                <w:sz w:val="20"/>
-              </w:rPr>
-              <w:t>Cartes pédagogiques, alertes (seuil configurable)</w:t>
-            </w:r>
-          </w:p>
-        </w:tc>
-      </w:tr>
-      <w:tr>
-        <w:tc>
-          <w:tcPr>
-            <w:tcW w:type="dxa" w:w="3135"/>
-          </w:tcPr>
-          <w:p>
-            <w:pPr>
-              <w:jc w:val="left"/>
-            </w:pPr>
-            <w:r>
-              <w:rPr>
-                <w:sz w:val="20"/>
-              </w:rPr>
-              <w:t>**Avancement VH (sessions clôturées)**</w:t>
-            </w:r>
-          </w:p>
-        </w:tc>
-        <w:tc>
-          <w:tcPr>
-            <w:tcW w:type="dxa" w:w="3135"/>
-          </w:tcPr>
-          <w:p>
-            <w:pPr>
-              <w:jc w:val="left"/>
-            </w:pPr>
-            <w:r>
-              <w:rPr>
-                <w:sz w:val="20"/>
-              </w:rPr>
-              <w:t>heures réalisées ÷ heures prévues</w:t>
-            </w:r>
-          </w:p>
-        </w:tc>
-        <w:tc>
-          <w:tcPr>
-            <w:tcW w:type="dxa" w:w="3135"/>
-          </w:tcPr>
-          <w:p>
-            <w:pPr>
-              <w:jc w:val="left"/>
-            </w:pPr>
-            <w:r>
-              <w:rPr>
-                <w:sz w:val="20"/>
-              </w:rPr>
-              <w:t>KPI volume horaire, alertes</w:t>
-            </w:r>
-          </w:p>
-        </w:tc>
-      </w:tr>
-    </w:tbl>
-    <w:p/>
-    <w:p>
-      <w:r>
-        <w:rPr>
-          <w:sz w:val="22"/>
-        </w:rPr>
-        <w:t>Les infobulles (icône ℹ sur les cartes KPI) décrivent chaque indicateur au survol.</w:t>
-      </w:r>
-    </w:p>
-    <w:p>
-      <w:r>
-        <w:rPr>
-          <w:b/>
-          <w:sz w:val="22"/>
-        </w:rPr>
-        <w:t>Compatibilité API :</w:t>
-      </w:r>
-      <w:r>
-        <w:rPr>
-          <w:sz w:val="22"/>
-        </w:rPr>
-        <w:t xml:space="preserve"> le champ technique `taux_achevement` reste disponible ; il correspond à </w:t>
-      </w:r>
-      <w:r>
-        <w:rPr>
-          <w:b/>
-          <w:sz w:val="22"/>
-        </w:rPr>
-        <w:t>Couverture auditeurs</w:t>
-      </w:r>
-      <w:r>
-        <w:rPr>
-          <w:sz w:val="22"/>
-        </w:rPr>
-        <w:t xml:space="preserve"> (`taux_couverture_auditeurs`).</w:t>
-      </w:r>
-    </w:p>
     <w:p>
       <w:pPr>
         <w:pStyle w:val="Heading3"/>
@@ -3825,7 +3302,7 @@
         <w:rPr>
           <w:sz w:val="22"/>
         </w:rPr>
-        <w:t>**Assiduité séance** (anciennement « taux de présence »)</w:t>
+        <w:t>**Taux de présence**</w:t>
       </w:r>
     </w:p>
     <w:p>
@@ -3836,7 +3313,7 @@
         <w:rPr>
           <w:sz w:val="22"/>
         </w:rPr>
-        <w:t>**Avancement VH (sessions clôturées)**</w:t>
+        <w:t>**Taux d'exécution du volume horaire**</w:t>
       </w:r>
     </w:p>
     <w:p>
@@ -3855,7 +3332,7 @@
         <w:rPr>
           <w:sz w:val="22"/>
         </w:rPr>
-        <w:t>Chaque jauge indique : valeur actuelle, seuils ⚠ et 🔴, niveau (Conforme / Avertissement / Critique). Une infobulle décrit le calcul de chaque indicateur.</w:t>
+        <w:t>Chaque jauge indique : valeur actuelle, seuils ⚠ et 🔴, niveau (Conforme / Avertissement / Critique).</w:t>
       </w:r>
     </w:p>
     <w:p>
@@ -4079,7 +3556,7 @@
               <w:rPr>
                 <w:sz w:val="20"/>
               </w:rPr>
-              <w:t>**Modules / Cours**</w:t>
+              <w:t>**Modules**</w:t>
             </w:r>
           </w:p>
         </w:tc>
@@ -4095,7 +3572,7 @@
               <w:rPr>
                 <w:sz w:val="20"/>
               </w:rPr>
-              <w:t>Nombre de modules</w:t>
+              <w:t>Nombre de modules (plusieurs modules peuvent appartenir à une même formation)</w:t>
             </w:r>
           </w:p>
         </w:tc>
@@ -4329,7 +3806,7 @@
               <w:rPr>
                 <w:sz w:val="20"/>
               </w:rPr>
-              <w:t>**Avancement VH (sessions clôturées)**</w:t>
+              <w:t>**Taux exéc. vol. horaire**</w:t>
             </w:r>
           </w:p>
         </w:tc>
@@ -4423,7 +3900,7 @@
               <w:rPr>
                 <w:sz w:val="20"/>
               </w:rPr>
-              <w:t>**Indicateurs pédagogiques**</w:t>
+              <w:t>**Taux de présence (global)**</w:t>
             </w:r>
           </w:p>
         </w:tc>
@@ -4439,7 +3916,7 @@
               <w:rPr>
                 <w:sz w:val="20"/>
               </w:rPr>
-              <w:t>Deux cartes principales (**Assiduité séance**, **Couverture auditeurs**) puis les quatre taux détaillés</w:t>
+              <w:t>4 pourcentages : Présence, Absence, Abandon, Achèvement</w:t>
             </w:r>
           </w:p>
         </w:tc>
@@ -4696,7 +4173,7 @@
               <w:rPr>
                 <w:sz w:val="20"/>
               </w:rPr>
-              <w:t>**Événements**</w:t>
+              <w:t>**Abandons**</w:t>
             </w:r>
           </w:p>
         </w:tc>
@@ -4712,7 +4189,7 @@
               <w:rPr>
                 <w:sz w:val="20"/>
               </w:rPr>
-              <w:t>Pointages « absent non badgé » ou « hors ligne suspect »</w:t>
+              <w:t>Abandons enregistrés</w:t>
             </w:r>
           </w:p>
         </w:tc>
@@ -4730,7 +4207,7 @@
               <w:rPr>
                 <w:sz w:val="20"/>
               </w:rPr>
-              <w:t>**Assiduité séance**</w:t>
+              <w:t>**Taux présence / absence / abandon / achèvement**</w:t>
             </w:r>
           </w:p>
         </w:tc>
@@ -4746,149 +4223,13 @@
               <w:rPr>
                 <w:sz w:val="20"/>
               </w:rPr>
-              <w:t>Places présentes ÷ places attendues (séances terminées)</w:t>
-            </w:r>
-          </w:p>
-        </w:tc>
-      </w:tr>
-      <w:tr>
-        <w:tc>
-          <w:tcPr>
-            <w:tcW w:type="dxa" w:w="4703"/>
-          </w:tcPr>
-          <w:p>
-            <w:pPr>
-              <w:jc w:val="left"/>
-            </w:pPr>
-            <w:r>
-              <w:rPr>
-                <w:sz w:val="20"/>
-              </w:rPr>
-              <w:t>**Couverture auditeurs**</w:t>
-            </w:r>
-          </w:p>
-        </w:tc>
-        <w:tc>
-          <w:tcPr>
-            <w:tcW w:type="dxa" w:w="4703"/>
-          </w:tcPr>
-          <w:p>
-            <w:pPr>
-              <w:jc w:val="left"/>
-            </w:pPr>
-            <w:r>
-              <w:rPr>
-                <w:sz w:val="20"/>
-              </w:rPr>
-              <w:t>Auditeurs avec ≥ 1 présence ÷ inscrits</w:t>
-            </w:r>
-          </w:p>
-        </w:tc>
-      </w:tr>
-      <w:tr>
-        <w:tc>
-          <w:tcPr>
-            <w:tcW w:type="dxa" w:w="4703"/>
-          </w:tcPr>
-          <w:p>
-            <w:pPr>
-              <w:jc w:val="left"/>
-            </w:pPr>
-            <w:r>
-              <w:rPr>
-                <w:sz w:val="20"/>
-              </w:rPr>
-              <w:t>**Absence séance**</w:t>
-            </w:r>
-          </w:p>
-        </w:tc>
-        <w:tc>
-          <w:tcPr>
-            <w:tcW w:type="dxa" w:w="4703"/>
-          </w:tcPr>
-          <w:p>
-            <w:pPr>
-              <w:jc w:val="left"/>
-            </w:pPr>
-            <w:r>
-              <w:rPr>
-                <w:sz w:val="20"/>
-              </w:rPr>
-              <w:t>Places absentes ÷ places attendues</w:t>
-            </w:r>
-          </w:p>
-        </w:tc>
-      </w:tr>
-      <w:tr>
-        <w:tc>
-          <w:tcPr>
-            <w:tcW w:type="dxa" w:w="4703"/>
-          </w:tcPr>
-          <w:p>
-            <w:pPr>
-              <w:jc w:val="left"/>
-            </w:pPr>
-            <w:r>
-              <w:rPr>
-                <w:sz w:val="20"/>
-              </w:rPr>
-              <w:t>**Événements absence / suspect**</w:t>
-            </w:r>
-          </w:p>
-        </w:tc>
-        <w:tc>
-          <w:tcPr>
-            <w:tcW w:type="dxa" w:w="4703"/>
-          </w:tcPr>
-          <w:p>
-            <w:pPr>
-              <w:jc w:val="left"/>
-            </w:pPr>
-            <w:r>
-              <w:rPr>
-                <w:sz w:val="20"/>
-              </w:rPr>
-              <w:t>Événements atypiques ÷ inscrits</w:t>
+              <w:t>Pourcentages calculés sur l'effectif</w:t>
             </w:r>
           </w:p>
         </w:tc>
       </w:tr>
     </w:tbl>
     <w:p/>
-    <w:p>
-      <w:r>
-        <w:rPr>
-          <w:sz w:val="22"/>
-        </w:rPr>
-        <w:t xml:space="preserve">Les cartes </w:t>
-      </w:r>
-      <w:r>
-        <w:rPr>
-          <w:b/>
-          <w:sz w:val="22"/>
-        </w:rPr>
-        <w:t>Assiduité séance</w:t>
-      </w:r>
-      <w:r>
-        <w:rPr>
-          <w:sz w:val="22"/>
-        </w:rPr>
-        <w:t xml:space="preserve"> et </w:t>
-      </w:r>
-      <w:r>
-        <w:rPr>
-          <w:b/>
-          <w:sz w:val="22"/>
-        </w:rPr>
-        <w:t>Couverture auditeurs</w:t>
-      </w:r>
-      <w:r>
-        <w:rPr>
-          <w:sz w:val="22"/>
-        </w:rPr>
-        <w:t xml:space="preserve"> sont mises en avant côte à côte en tête de l'onglet.</w:t>
-      </w:r>
-    </w:p>
     <w:p>
       <w:pPr>
         <w:pStyle w:val="Heading3"/>
@@ -4960,7 +4301,7 @@
               <w:rPr>
                 <w:sz w:val="20"/>
               </w:rPr>
-              <w:t>**Assiduité séance par formation (10 der.)**</w:t>
+              <w:t>**Taux de présence par formation (10 der.)**</w:t>
             </w:r>
           </w:p>
         </w:tc>
@@ -4994,7 +4335,7 @@
               <w:rPr>
                 <w:sz w:val="20"/>
               </w:rPr>
-              <w:t>**Assiduité séance par grade**</w:t>
+              <w:t>**Taux de présence par grade**</w:t>
             </w:r>
           </w:p>
         </w:tc>
@@ -5062,7 +4403,7 @@
               <w:rPr>
                 <w:sz w:val="20"/>
               </w:rPr>
-              <w:t>**Assiduité séance par secrétariat**</w:t>
+              <w:t>**Taux de présence par secrétariat**</w:t>
             </w:r>
           </w:p>
         </w:tc>
@@ -7634,6 +6975,34 @@
         <w:t xml:space="preserve"> un auditeur est « présent » s'il possède au moins un pointage au statut présent sur les séances filtrées (année, mois ou date calendrier).</w:t>
       </w:r>
     </w:p>
+    <w:p>
+      <w:r>
+        <w:rPr>
+          <w:b/>
+          <w:sz w:val="22"/>
+        </w:rPr>
+        <w:t>Sans séance comptabilisable</w:t>
+      </w:r>
+      <w:r>
+        <w:rPr>
+          <w:sz w:val="22"/>
+        </w:rPr>
+        <w:t xml:space="preserve"> sur la période filtrée : </w:t>
+      </w:r>
+      <w:r>
+        <w:rPr>
+          <w:b/>
+          <w:sz w:val="22"/>
+        </w:rPr>
+        <w:t>aucun tableau d'effectifs</w:t>
+      </w:r>
+      <w:r>
+        <w:rPr>
+          <w:sz w:val="22"/>
+        </w:rPr>
+        <w:t xml:space="preserve"> n'est généré (le module / la matière / la catégorie n'apparaît pas dans la liste des bilans).</w:t>
+      </w:r>
+    </w:p>
     <w:p/>
     <w:p>
       <w:pPr>
@@ -9555,7 +8924,20 @@
         <w:rPr>
           <w:sz w:val="22"/>
         </w:rPr>
-        <w:t>Pour chaque créneau (MATIN / SOIR) :</w:t>
+        <w:t xml:space="preserve">Pour chaque créneau (MATIN / SOIR), </w:t>
+      </w:r>
+      <w:r>
+        <w:rPr>
+          <w:b/>
+          <w:sz w:val="22"/>
+        </w:rPr>
+        <w:t>seuls les groupes ayant une séance planifiée ce jour-là</w:t>
+      </w:r>
+      <w:r>
+        <w:rPr>
+          <w:sz w:val="22"/>
+        </w:rPr>
+        <w:t xml:space="preserve"> apparaissent en colonne (un groupe sans cours le matin n'est pas listé au MATIN, etc.).</w:t>
       </w:r>
     </w:p>
     <w:tbl>
@@ -10613,7 +9995,7 @@
               <w:rPr>
                 <w:sz w:val="20"/>
               </w:rPr>
-              <w:t>Taux d'abandon</w:t>
+              <w:t>Événements absence / suspect</w:t>
             </w:r>
           </w:p>
         </w:tc>
@@ -10629,7 +10011,7 @@
               <w:rPr>
                 <w:sz w:val="20"/>
               </w:rPr>
-              <w:t>Plus bas = mieux (inverse)</w:t>
+              <w:t>Pointages ABSENT_NON_BADGE ou HORS_LIGNE_SUSPECT / inscrits — plus bas = mieux</w:t>
             </w:r>
           </w:p>
         </w:tc>
@@ -10713,7 +10095,7 @@
               <w:rPr>
                 <w:sz w:val="20"/>
               </w:rPr>
-              <w:t>Absences notoires</w:t>
+              <w:t>Absents notoires</w:t>
             </w:r>
           </w:p>
         </w:tc>
@@ -10729,7 +10111,7 @@
               <w:rPr>
                 <w:sz w:val="20"/>
               </w:rPr>
-              <w:t>Plus bas = mieux (inverse)</w:t>
+              <w:t>Inscrits à un module démarré sans présence, ou avec motif notoire — plus bas = mieux</w:t>
             </w:r>
           </w:p>
         </w:tc>
@@ -10779,7 +10161,7 @@
               <w:rPr>
                 <w:sz w:val="20"/>
               </w:rPr>
-              <w:t>Plus bas = mieux (inverse)</w:t>
+              <w:t>Moy. inscrits/groupe ÷ 40 — plus bas = mieux</w:t>
             </w:r>
           </w:p>
         </w:tc>
@@ -11973,6 +11355,356 @@
                 <w:sz w:val="20"/>
               </w:rPr>
               <w:t>Point journalier aligné modèle Excel FAC 2025 : titre par catégorie, feuille par grade, visuel web CPFAE (orange/jaune), colonne TOTAL et bande vague</w:t>
+            </w:r>
+          </w:p>
+        </w:tc>
+      </w:tr>
+      <w:tr>
+        <w:tc>
+          <w:tcPr>
+            <w:tcW w:type="dxa" w:w="3135"/>
+          </w:tcPr>
+          <w:p>
+            <w:pPr>
+              <w:jc w:val="left"/>
+            </w:pPr>
+            <w:r>
+              <w:rPr>
+                <w:sz w:val="20"/>
+              </w:rPr>
+              <w:t>2.2.1</w:t>
+            </w:r>
+          </w:p>
+        </w:tc>
+        <w:tc>
+          <w:tcPr>
+            <w:tcW w:type="dxa" w:w="3135"/>
+          </w:tcPr>
+          <w:p>
+            <w:pPr>
+              <w:jc w:val="left"/>
+            </w:pPr>
+            <w:r>
+              <w:rPr>
+                <w:sz w:val="20"/>
+              </w:rPr>
+              <w:t>16/06/2026</w:t>
+            </w:r>
+          </w:p>
+        </w:tc>
+        <w:tc>
+          <w:tcPr>
+            <w:tcW w:type="dxa" w:w="3135"/>
+          </w:tcPr>
+          <w:p>
+            <w:pPr>
+              <w:jc w:val="left"/>
+            </w:pPr>
+            <w:r>
+              <w:rPr>
+                <w:sz w:val="20"/>
+              </w:rPr>
+              <w:t>Terminologie unifiée « Absents notoires » (remplace « Auditeurs notoires ») — KPI, panneaux, alertes et seuils</w:t>
+            </w:r>
+          </w:p>
+        </w:tc>
+      </w:tr>
+      <w:tr>
+        <w:tc>
+          <w:tcPr>
+            <w:tcW w:type="dxa" w:w="3135"/>
+          </w:tcPr>
+          <w:p>
+            <w:pPr>
+              <w:jc w:val="left"/>
+            </w:pPr>
+            <w:r>
+              <w:rPr>
+                <w:sz w:val="20"/>
+              </w:rPr>
+              <w:t>2.2.2</w:t>
+            </w:r>
+          </w:p>
+        </w:tc>
+        <w:tc>
+          <w:tcPr>
+            <w:tcW w:type="dxa" w:w="3135"/>
+          </w:tcPr>
+          <w:p>
+            <w:pPr>
+              <w:jc w:val="left"/>
+            </w:pPr>
+            <w:r>
+              <w:rPr>
+                <w:sz w:val="20"/>
+              </w:rPr>
+              <w:t>16/06/2026</w:t>
+            </w:r>
+          </w:p>
+        </w:tc>
+        <w:tc>
+          <w:tcPr>
+            <w:tcW w:type="dxa" w:w="3135"/>
+          </w:tcPr>
+          <w:p>
+            <w:pPr>
+              <w:jc w:val="left"/>
+            </w:pPr>
+            <w:r>
+              <w:rPr>
+                <w:sz w:val="20"/>
+              </w:rPr>
+              <w:t>Règle absents notoires : module démarré + aucune présence enregistrée (ou motif notoire)</w:t>
+            </w:r>
+          </w:p>
+        </w:tc>
+      </w:tr>
+      <w:tr>
+        <w:tc>
+          <w:tcPr>
+            <w:tcW w:type="dxa" w:w="3135"/>
+          </w:tcPr>
+          <w:p>
+            <w:pPr>
+              <w:jc w:val="left"/>
+            </w:pPr>
+            <w:r>
+              <w:rPr>
+                <w:sz w:val="20"/>
+              </w:rPr>
+              <w:t>2.2.3</w:t>
+            </w:r>
+          </w:p>
+        </w:tc>
+        <w:tc>
+          <w:tcPr>
+            <w:tcW w:type="dxa" w:w="3135"/>
+          </w:tcPr>
+          <w:p>
+            <w:pPr>
+              <w:jc w:val="left"/>
+            </w:pPr>
+            <w:r>
+              <w:rPr>
+                <w:sz w:val="20"/>
+              </w:rPr>
+              <w:t>16/06/2026</w:t>
+            </w:r>
+          </w:p>
+        </w:tc>
+        <w:tc>
+          <w:tcPr>
+            <w:tcW w:type="dxa" w:w="3135"/>
+          </w:tcPr>
+          <w:p>
+            <w:pPr>
+              <w:jc w:val="left"/>
+            </w:pPr>
+            <w:r>
+              <w:rPr>
+                <w:sz w:val="20"/>
+              </w:rPr>
+              <w:t>Point journalier : colonnes GROUPES limitées aux groupes avec séance le jour J (MATIN/SOIR)</w:t>
+            </w:r>
+          </w:p>
+        </w:tc>
+      </w:tr>
+      <w:tr>
+        <w:tc>
+          <w:tcPr>
+            <w:tcW w:type="dxa" w:w="3135"/>
+          </w:tcPr>
+          <w:p>
+            <w:pPr>
+              <w:jc w:val="left"/>
+            </w:pPr>
+            <w:r>
+              <w:rPr>
+                <w:sz w:val="20"/>
+              </w:rPr>
+              <w:t>2.2.4</w:t>
+            </w:r>
+          </w:p>
+        </w:tc>
+        <w:tc>
+          <w:tcPr>
+            <w:tcW w:type="dxa" w:w="3135"/>
+          </w:tcPr>
+          <w:p>
+            <w:pPr>
+              <w:jc w:val="left"/>
+            </w:pPr>
+            <w:r>
+              <w:rPr>
+                <w:sz w:val="20"/>
+              </w:rPr>
+              <w:t>16/06/2026</w:t>
+            </w:r>
+          </w:p>
+        </w:tc>
+        <w:tc>
+          <w:tcPr>
+            <w:tcW w:type="dxa" w:w="3135"/>
+          </w:tcPr>
+          <w:p>
+            <w:pPr>
+              <w:jc w:val="left"/>
+            </w:pPr>
+            <w:r>
+              <w:rPr>
+                <w:sz w:val="20"/>
+              </w:rPr>
+              <w:t>Bilans effectifs (module / catégorie / matière) : aucun tableau si aucune séance comptabilisable sur la période</w:t>
+            </w:r>
+          </w:p>
+        </w:tc>
+      </w:tr>
+      <w:tr>
+        <w:tc>
+          <w:tcPr>
+            <w:tcW w:type="dxa" w:w="3135"/>
+          </w:tcPr>
+          <w:p>
+            <w:pPr>
+              <w:jc w:val="left"/>
+            </w:pPr>
+            <w:r>
+              <w:rPr>
+                <w:sz w:val="20"/>
+              </w:rPr>
+              <w:t>2.2.5</w:t>
+            </w:r>
+          </w:p>
+        </w:tc>
+        <w:tc>
+          <w:tcPr>
+            <w:tcW w:type="dxa" w:w="3135"/>
+          </w:tcPr>
+          <w:p>
+            <w:pPr>
+              <w:jc w:val="left"/>
+            </w:pPr>
+            <w:r>
+              <w:rPr>
+                <w:sz w:val="20"/>
+              </w:rPr>
+              <w:t>26/08/2026</w:t>
+            </w:r>
+          </w:p>
+        </w:tc>
+        <w:tc>
+          <w:tcPr>
+            <w:tcW w:type="dxa" w:w="3135"/>
+          </w:tcPr>
+          <w:p>
+            <w:pPr>
+              <w:jc w:val="left"/>
+            </w:pPr>
+            <w:r>
+              <w:rPr>
+                <w:sz w:val="20"/>
+              </w:rPr>
+              <w:t>Charte visuelle alignée sur la page de connexion INJS (navy / bleu poussiéreux) : onglets, bandeaux de section et boutons d’action. Les indicateurs de conformité / présence restent en vert.</w:t>
+            </w:r>
+          </w:p>
+        </w:tc>
+      </w:tr>
+      <w:tr>
+        <w:tc>
+          <w:tcPr>
+            <w:tcW w:type="dxa" w:w="3135"/>
+          </w:tcPr>
+          <w:p>
+            <w:pPr>
+              <w:jc w:val="left"/>
+            </w:pPr>
+            <w:r>
+              <w:rPr>
+                <w:sz w:val="20"/>
+              </w:rPr>
+              <w:t>2.2.6</w:t>
+            </w:r>
+          </w:p>
+        </w:tc>
+        <w:tc>
+          <w:tcPr>
+            <w:tcW w:type="dxa" w:w="3135"/>
+          </w:tcPr>
+          <w:p>
+            <w:pPr>
+              <w:jc w:val="left"/>
+            </w:pPr>
+            <w:r>
+              <w:rPr>
+                <w:sz w:val="20"/>
+              </w:rPr>
+              <w:t>26/08/2026</w:t>
+            </w:r>
+          </w:p>
+        </w:tc>
+        <w:tc>
+          <w:tcPr>
+            <w:tcW w:type="dxa" w:w="3135"/>
+          </w:tcPr>
+          <w:p>
+            <w:pPr>
+              <w:jc w:val="left"/>
+            </w:pPr>
+            <w:r>
+              <w:rPr>
+                <w:sz w:val="20"/>
+              </w:rPr>
+              <w:t>Libellés INJS : « Auditeurs » → « Étudiants », « Formateurs » → « Enseignants » (KPI, cartes, tableaux). Les codes API restent inchangés.</w:t>
+            </w:r>
+          </w:p>
+        </w:tc>
+      </w:tr>
+      <w:tr>
+        <w:tc>
+          <w:tcPr>
+            <w:tcW w:type="dxa" w:w="3135"/>
+          </w:tcPr>
+          <w:p>
+            <w:pPr>
+              <w:jc w:val="left"/>
+            </w:pPr>
+            <w:r>
+              <w:rPr>
+                <w:sz w:val="20"/>
+              </w:rPr>
+              <w:t>2.2.7</w:t>
+            </w:r>
+          </w:p>
+        </w:tc>
+        <w:tc>
+          <w:tcPr>
+            <w:tcW w:type="dxa" w:w="3135"/>
+          </w:tcPr>
+          <w:p>
+            <w:pPr>
+              <w:jc w:val="left"/>
+            </w:pPr>
+            <w:r>
+              <w:rPr>
+                <w:sz w:val="20"/>
+              </w:rPr>
+              <w:t>26/08/2026</w:t>
+            </w:r>
+          </w:p>
+        </w:tc>
+        <w:tc>
+          <w:tcPr>
+            <w:tcW w:type="dxa" w:w="3135"/>
+          </w:tcPr>
+          <w:p>
+            <w:pPr>
+              <w:jc w:val="left"/>
+            </w:pPr>
+            <w:r>
+              <w:rPr>
+                <w:sz w:val="20"/>
+              </w:rPr>
+              <w:t>KPI « Modules / Cours » → « Modules » : une formation peut regrouper un ou plusieurs modules.</w:t>
             </w:r>
           </w:p>
         </w:tc>

</xml_diff>